<commit_message>
Align submission materials with ESL feedback demo
</commit_message>
<xml_diff>
--- a/docs/ConsensusScope_EMNLP_demo_script_2min30_en.docx
+++ b/docs/ConsensusScope_EMNLP_demo_script_2min30_en.docx
@@ -68,7 +68,7 @@
           <w:rFonts w:ascii="Arial" w:hAnsi="Arial" w:eastAsia="Arial"/>
           <w:sz w:val="20"/>
         </w:rPr>
-        <w:t>Multi-model agreement is useful evidence, but it is not proof of correctness. ConsensusScope exposes when to accept, inspect, or route a multi-LLM decision for human review.</w:t>
+        <w:t>AI writing feedback can be fluent but unsafe. ConsensusScope routes ESL comparative-literature feedback into low-risk auto-accept and teacher-review queues with literary knowledge evidence.</w:t>
       </w:r>
     </w:p>
     <w:p>
@@ -278,7 +278,7 @@
                 <w:b w:val="0"/>
                 <w:sz w:val="18"/>
               </w:rPr>
-              <w:t>Open Home / System Overview. Keep the pointer near the title and pipeline.</w:t>
+              <w:t>Open Home / System Overview. Keep the pointer near the title and workflow.</w:t>
             </w:r>
           </w:p>
         </w:tc>
@@ -384,7 +384,7 @@
                 <w:b w:val="0"/>
                 <w:sz w:val="18"/>
               </w:rPr>
-              <w:t>Show API Configuration. Then click Live Question Mode and show task input.</w:t>
+              <w:t>Click ESL Feedback Review. Show the essay input and reviewer source selector.</w:t>
             </w:r>
           </w:p>
         </w:tc>
@@ -410,7 +410,7 @@
                 <w:b w:val="0"/>
                 <w:sz w:val="18"/>
               </w:rPr>
-              <w:t>Live workflow and API safety</w:t>
+              <w:t>System overview</w:t>
             </w:r>
           </w:p>
         </w:tc>
@@ -464,7 +464,7 @@
                 <w:b w:val="0"/>
                 <w:sz w:val="18"/>
               </w:rPr>
-              <w:t>Page 3</w:t>
+              <w:t>Page 2</w:t>
             </w:r>
           </w:p>
         </w:tc>
@@ -490,7 +490,7 @@
                 <w:b w:val="0"/>
                 <w:sz w:val="18"/>
               </w:rPr>
-              <w:t>Click Sample Audit Mode. Select a saved benchmark sample and show model outputs.</w:t>
+              <w:t>Run the no-API demo and open Knowledge Evidence.</w:t>
             </w:r>
           </w:p>
         </w:tc>
@@ -516,7 +516,7 @@
                 <w:b w:val="0"/>
                 <w:sz w:val="18"/>
               </w:rPr>
-              <w:t>Structured traces</w:t>
+              <w:t>Knowledge grounding</w:t>
             </w:r>
           </w:p>
         </w:tc>
@@ -544,7 +544,7 @@
                 <w:b w:val="0"/>
                 <w:sz w:val="18"/>
               </w:rPr>
-              <w:t>1:10-1:35</w:t>
+              <w:t>1:10-1:40</w:t>
             </w:r>
           </w:p>
         </w:tc>
@@ -570,7 +570,7 @@
                 <w:b w:val="0"/>
                 <w:sz w:val="18"/>
               </w:rPr>
-              <w:t>Page 4</w:t>
+              <w:t>Page 2/3</w:t>
             </w:r>
           </w:p>
         </w:tc>
@@ -596,7 +596,7 @@
                 <w:b w:val="0"/>
                 <w:sz w:val="18"/>
               </w:rPr>
-              <w:t>Click Adjudication Comparison. Point to majority vote, fixed judge, dynamic judge.</w:t>
+              <w:t>Show Teacher View, Adjudication Trace, then Knowledge Grounding &amp; Teacher Queue.</w:t>
             </w:r>
           </w:p>
         </w:tc>
@@ -622,7 +622,7 @@
                 <w:b w:val="0"/>
                 <w:sz w:val="18"/>
               </w:rPr>
-              <w:t>Adjudication layer</w:t>
+              <w:t>Feedback routing</w:t>
             </w:r>
           </w:p>
         </w:tc>
@@ -650,7 +650,7 @@
                 <w:b w:val="0"/>
                 <w:sz w:val="18"/>
               </w:rPr>
-              <w:t>1:35-2:00</w:t>
+              <w:t>1:40-2:05</w:t>
             </w:r>
           </w:p>
         </w:tc>
@@ -676,7 +676,7 @@
                 <w:b w:val="0"/>
                 <w:sz w:val="18"/>
               </w:rPr>
-              <w:t>Page 5</w:t>
+              <w:t>Page 3</w:t>
             </w:r>
           </w:p>
         </w:tc>
@@ -702,7 +702,7 @@
                 <w:b w:val="0"/>
                 <w:sz w:val="18"/>
               </w:rPr>
-              <w:t>Click Risk Dashboard. Point to low-risk accuracy and high-risk error rate.</w:t>
+              <w:t>Point to risk level, priority, model agreement, and KG support.</w:t>
             </w:r>
           </w:p>
         </w:tc>
@@ -728,7 +728,7 @@
                 <w:b w:val="0"/>
                 <w:sz w:val="18"/>
               </w:rPr>
-              <w:t>Risk stratification</w:t>
+              <w:t>Teacher review queue</w:t>
             </w:r>
           </w:p>
         </w:tc>
@@ -756,7 +756,7 @@
                 <w:b w:val="0"/>
                 <w:sz w:val="18"/>
               </w:rPr>
-              <w:t>2:00-2:20</w:t>
+              <w:t>2:05-2:25</w:t>
             </w:r>
           </w:p>
         </w:tc>
@@ -782,7 +782,7 @@
                 <w:b w:val="0"/>
                 <w:sz w:val="18"/>
               </w:rPr>
-              <w:t>Page 7/8</w:t>
+              <w:t>Page 8</w:t>
             </w:r>
           </w:p>
         </w:tc>
@@ -808,7 +808,7 @@
                 <w:b w:val="0"/>
                 <w:sz w:val="18"/>
               </w:rPr>
-              <w:t>Click Case Explorer, then Report Export. Show case inspection and download buttons.</w:t>
+              <w:t>Click Report Export and show the report download buttons.</w:t>
             </w:r>
           </w:p>
         </w:tc>
@@ -834,7 +834,7 @@
                 <w:b w:val="0"/>
                 <w:sz w:val="18"/>
               </w:rPr>
-              <w:t>Audit and export</w:t>
+              <w:t>Export</w:t>
             </w:r>
           </w:p>
         </w:tc>
@@ -862,7 +862,7 @@
                 <w:b w:val="0"/>
                 <w:sz w:val="18"/>
               </w:rPr>
-              <w:t>2:20-2:30</w:t>
+              <w:t>2:25-2:30</w:t>
             </w:r>
           </w:p>
         </w:tc>
@@ -888,7 +888,7 @@
                 <w:b w:val="0"/>
                 <w:sz w:val="18"/>
               </w:rPr>
-              <w:t>Page 1</w:t>
+              <w:t>Page 1/8</w:t>
             </w:r>
           </w:p>
         </w:tc>
@@ -914,7 +914,7 @@
                 <w:b w:val="0"/>
                 <w:sz w:val="18"/>
               </w:rPr>
-              <w:t>Return to Home. Stop moving the mouse and close with one sentence.</w:t>
+              <w:t>Stop moving the mouse and close with one sentence.</w:t>
             </w:r>
           </w:p>
         </w:tc>
@@ -1039,7 +1039,7 @@
           <w:rFonts w:ascii="Arial" w:hAnsi="Arial" w:eastAsia="Arial"/>
           <w:sz w:val="20"/>
         </w:rPr>
-        <w:t>ConsensusScope is an interactive observability tool for risk-aware multi-LLM adjudication. It starts from a simple premise: multi-model agreement is useful evidence, but agreement alone is not proof of correctness.</w:t>
+        <w:t>AI writing feedback can be fluent but unsafe. In ESL comparative-literature essays, a model may fix grammar correctly while changing literary facts, character relations, or the student's interpretation.</w:t>
       </w:r>
     </w:p>
     <w:p>
@@ -1052,7 +1052,7 @@
           <w:b/>
           <w:sz w:val="24"/>
         </w:rPr>
-        <w:t>0:20-0:45  API configuration and live mode</w:t>
+        <w:t>0:20-0:45  System overview</w:t>
       </w:r>
     </w:p>
     <w:p>
@@ -1104,7 +1104,7 @@
           <w:rFonts w:ascii="Arial" w:hAnsi="Arial" w:eastAsia="Arial"/>
           <w:sz w:val="18"/>
         </w:rPr>
-        <w:t>Click Page 2: Live Question Mode.</w:t>
+        <w:t>Click Page 2: ESL Feedback Review.</w:t>
       </w:r>
     </w:p>
     <w:p>
@@ -1117,7 +1117,7 @@
           <w:rFonts w:ascii="Arial" w:hAnsi="Arial" w:eastAsia="Arial"/>
           <w:sz w:val="18"/>
         </w:rPr>
-        <w:t>Show the task-type selector, question input, model selection area, and Run Live Comparison button.</w:t>
+        <w:t>Show the essay input, reviewer source selector, and Run Knowledge-Grounded Feedback button.</w:t>
       </w:r>
     </w:p>
     <w:p>
@@ -1139,7 +1139,7 @@
           <w:rFonts w:ascii="Arial" w:hAnsi="Arial" w:eastAsia="Arial"/>
           <w:sz w:val="20"/>
         </w:rPr>
-        <w:t>The system supports two API modes. Mode A is for controlled local demos using configured environment variables or deployment secrets. Mode B is for public deployment, where users provide their own temporary API keys. API keys are not written into the paper and are not hard-coded in the repository.</w:t>
+        <w:t>ConsensusScope compares multiple LLM feedback outputs and routes each suggestion into either low-risk auto-accept or teacher review. It is not an automatic essay scorer and it does not replace teacher judgment.</w:t>
       </w:r>
     </w:p>
     <w:p>
@@ -1152,7 +1152,7 @@
           <w:b/>
           <w:sz w:val="24"/>
         </w:rPr>
-        <w:t>0:45-1:10  Structured multi-model traces</w:t>
+        <w:t>0:45-1:10  Knowledge grounding</w:t>
       </w:r>
     </w:p>
     <w:p>
@@ -1178,7 +1178,7 @@
           <w:rFonts w:ascii="Arial" w:hAnsi="Arial" w:eastAsia="Arial"/>
           <w:sz w:val="18"/>
         </w:rPr>
-        <w:t>Click Page 3: Sample Audit Mode.</w:t>
+        <w:t>Run the no-API deterministic feedback demo.</w:t>
       </w:r>
     </w:p>
     <w:p>
@@ -1191,7 +1191,7 @@
           <w:rFonts w:ascii="Arial" w:hAnsi="Arial" w:eastAsia="Arial"/>
           <w:sz w:val="18"/>
         </w:rPr>
-        <w:t>Select a dataset such as FEVER or CommonsenseQA.</w:t>
+        <w:t>Open the Knowledge Evidence tab.</w:t>
       </w:r>
     </w:p>
     <w:p>
@@ -1204,20 +1204,7 @@
           <w:rFonts w:ascii="Arial" w:hAnsi="Arial" w:eastAsia="Arial"/>
           <w:sz w:val="18"/>
         </w:rPr>
-        <w:t>Select a sample ID and scroll to the model-output area.</w:t>
-      </w:r>
-    </w:p>
-    <w:p>
-      <w:pPr>
-        <w:pStyle w:val="ListBullet"/>
-        <w:spacing w:after="40"/>
-      </w:pPr>
-      <w:r>
-        <w:rPr>
-          <w:rFonts w:ascii="Arial" w:hAnsi="Arial" w:eastAsia="Arial"/>
-          <w:sz w:val="18"/>
-        </w:rPr>
-        <w:t>Point to answer, reason, confidence, and evidence fields.</w:t>
+        <w:t>Point to author, genre, character, theme, and publication-year rows.</w:t>
       </w:r>
     </w:p>
     <w:p>
@@ -1239,7 +1226,7 @@
           <w:rFonts w:ascii="Arial" w:hAnsi="Arial" w:eastAsia="Arial"/>
           <w:sz w:val="20"/>
         </w:rPr>
-        <w:t>Each model output is stored in a unified schema, including answer, rationale, confidence, evidence, raw output, and parse metadata. This lets us inspect not only the final answer, but also whether models agree, whether evidence is available, and whether confidence signals are reliable.</w:t>
+        <w:t>The system retrieves evidence from a curated literary knowledge graph, including author, work, genre, central characters, themes, and publication year. These triples make factual feedback inspectable.</w:t>
       </w:r>
     </w:p>
     <w:p>
@@ -1252,7 +1239,7 @@
           <w:b/>
           <w:sz w:val="24"/>
         </w:rPr>
-        <w:t>1:10-1:35  Adjudication comparison</w:t>
+        <w:t>1:10-1:40  Feedback adjudication</w:t>
       </w:r>
     </w:p>
     <w:p>
@@ -1278,7 +1265,7 @@
           <w:rFonts w:ascii="Arial" w:hAnsi="Arial" w:eastAsia="Arial"/>
           <w:sz w:val="18"/>
         </w:rPr>
-        <w:t>Click Page 4: Adjudication Comparison.</w:t>
+        <w:t>Open the Teacher View tab.</w:t>
       </w:r>
     </w:p>
     <w:p>
@@ -1291,7 +1278,7 @@
           <w:rFonts w:ascii="Arial" w:hAnsi="Arial" w:eastAsia="Arial"/>
           <w:sz w:val="18"/>
         </w:rPr>
-        <w:t>Point first to Majority Vote.</w:t>
+        <w:t>Point to the auto-accepted preview.</w:t>
       </w:r>
     </w:p>
     <w:p>
@@ -1304,7 +1291,7 @@
           <w:rFonts w:ascii="Arial" w:hAnsi="Arial" w:eastAsia="Arial"/>
           <w:sz w:val="18"/>
         </w:rPr>
-        <w:t>Move to Fixed Judge.</w:t>
+        <w:t>Open the Adjudication Trace tab.</w:t>
       </w:r>
     </w:p>
     <w:p>
@@ -1317,7 +1304,7 @@
           <w:rFonts w:ascii="Arial" w:hAnsi="Arial" w:eastAsia="Arial"/>
           <w:sz w:val="18"/>
         </w:rPr>
-        <w:t>Move to Dynamic Rule-Based Judge.</w:t>
+        <w:t>Click Page 3: Knowledge Grounding &amp; Teacher Queue.</w:t>
       </w:r>
     </w:p>
     <w:p>
@@ -1339,7 +1326,7 @@
           <w:rFonts w:ascii="Arial" w:hAnsi="Arial" w:eastAsia="Arial"/>
           <w:sz w:val="20"/>
         </w:rPr>
-        <w:t>ConsensusScope compares three adjudication strategies. Majority vote is the frequency-based baseline. The fixed judge uses a configured judge model, by default deepseek-chat, and it does not see the gold answer. The rule-based dynamic judge uses deploy-time signals such as agreement rate, answer diversity, confidence distribution, evidence availability, minority warnings, and parse errors.</w:t>
+        <w:t>Low-risk local grammar or style edits can be accepted, but suggestions about authorship, genre, character identity, thesis statements, or interpretation remain in the teacher-review queue.</w:t>
       </w:r>
     </w:p>
     <w:p>
@@ -1352,7 +1339,7 @@
           <w:b/>
           <w:sz w:val="24"/>
         </w:rPr>
-        <w:t>1:35-2:00  Risk dashboard and evaluation</w:t>
+        <w:t>1:40-2:05  Teacher review queue</w:t>
       </w:r>
     </w:p>
     <w:p>
@@ -1378,7 +1365,7 @@
           <w:rFonts w:ascii="Arial" w:hAnsi="Arial" w:eastAsia="Arial"/>
           <w:sz w:val="18"/>
         </w:rPr>
-        <w:t>Click Page 5: Risk Dashboard.</w:t>
+        <w:t>Point to risk level, priority, agreement, and KG support fields.</w:t>
       </w:r>
     </w:p>
     <w:p>
@@ -1391,7 +1378,7 @@
           <w:rFonts w:ascii="Arial" w:hAnsi="Arial" w:eastAsia="Arial"/>
           <w:sz w:val="18"/>
         </w:rPr>
-        <w:t>Point to the low, medium, and high risk levels.</w:t>
+        <w:t>Briefly mention the auxiliary QA pages only if visible.</w:t>
       </w:r>
     </w:p>
     <w:p>
@@ -1404,20 +1391,7 @@
           <w:rFonts w:ascii="Arial" w:hAnsi="Arial" w:eastAsia="Arial"/>
           <w:sz w:val="18"/>
         </w:rPr>
-        <w:t>Pause near the low-risk accuracy number.</w:t>
-      </w:r>
-    </w:p>
-    <w:p>
-      <w:pPr>
-        <w:pStyle w:val="ListBullet"/>
-        <w:spacing w:after="40"/>
-      </w:pPr>
-      <w:r>
-        <w:rPr>
-          <w:rFonts w:ascii="Arial" w:hAnsi="Arial" w:eastAsia="Arial"/>
-          <w:sz w:val="18"/>
-        </w:rPr>
-        <w:t>Pause near the high-risk error-rate number.</w:t>
+        <w:t>Avoid presenting the old QA benchmark as the main system story.</w:t>
       </w:r>
     </w:p>
     <w:p>
@@ -1439,7 +1413,7 @@
           <w:rFonts w:ascii="Arial" w:hAnsi="Arial" w:eastAsia="Arial"/>
           <w:sz w:val="20"/>
         </w:rPr>
-        <w:t>In the 1000-sample pilot, we avoid a single mixed macro-F1 score because TruthfulQA, FEVER, and CommonsenseQA have different answer spaces. The key result is risk stratification: low-risk dynamic decisions reach 91.8 percent accuracy, while high-risk decisions concentrate errors with a 95.2 percent error rate.</w:t>
+        <w:t>The teacher review queue shows risk level, priority, model agreement, knowledge support, and a short explanation for why human review is recommended. The system also includes auxiliary multi-model QA audit pages, but this demo focuses on ESL literary feedback.</w:t>
       </w:r>
     </w:p>
     <w:p>
@@ -1452,7 +1426,7 @@
           <w:b/>
           <w:sz w:val="24"/>
         </w:rPr>
-        <w:t>2:00-2:20  Case explorer and report export</w:t>
+        <w:t>2:05-2:25  Report export</w:t>
       </w:r>
     </w:p>
     <w:p>
@@ -1478,32 +1452,6 @@
           <w:rFonts w:ascii="Arial" w:hAnsi="Arial" w:eastAsia="Arial"/>
           <w:sz w:val="18"/>
         </w:rPr>
-        <w:t>Click Page 7: Case Explorer.</w:t>
-      </w:r>
-    </w:p>
-    <w:p>
-      <w:pPr>
-        <w:pStyle w:val="ListBullet"/>
-        <w:spacing w:after="40"/>
-      </w:pPr>
-      <w:r>
-        <w:rPr>
-          <w:rFonts w:ascii="Arial" w:hAnsi="Arial" w:eastAsia="Arial"/>
-          <w:sz w:val="18"/>
-        </w:rPr>
-        <w:t>Open the Inspect case selector and choose one case.</w:t>
-      </w:r>
-    </w:p>
-    <w:p>
-      <w:pPr>
-        <w:pStyle w:val="ListBullet"/>
-        <w:spacing w:after="40"/>
-      </w:pPr>
-      <w:r>
-        <w:rPr>
-          <w:rFonts w:ascii="Arial" w:hAnsi="Arial" w:eastAsia="Arial"/>
-          <w:sz w:val="18"/>
-        </w:rPr>
         <w:t>Click Page 8: Report Export.</w:t>
       </w:r>
     </w:p>
@@ -1517,7 +1465,20 @@
           <w:rFonts w:ascii="Arial" w:hAnsi="Arial" w:eastAsia="Arial"/>
           <w:sz w:val="18"/>
         </w:rPr>
-        <w:t>Show system_summary.json, method_metrics.csv, and risk_labels.csv download buttons.</w:t>
+        <w:t>Show the literary feedback report download.</w:t>
+      </w:r>
+    </w:p>
+    <w:p>
+      <w:pPr>
+        <w:pStyle w:val="ListBullet"/>
+        <w:spacing w:after="40"/>
+      </w:pPr>
+      <w:r>
+        <w:rPr>
+          <w:rFonts w:ascii="Arial" w:hAnsi="Arial" w:eastAsia="Arial"/>
+          <w:sz w:val="18"/>
+        </w:rPr>
+        <w:t>Show system_summary.json and CSV export buttons.</w:t>
       </w:r>
     </w:p>
     <w:p>
@@ -1539,7 +1500,7 @@
           <w:rFonts w:ascii="Arial" w:hAnsi="Arial" w:eastAsia="Arial"/>
           <w:sz w:val="20"/>
         </w:rPr>
-        <w:t>The case explorer supports sample-level auditing, while the export page packages reports and CSV files for reproducibility. Offline labels such as false consensus or minority-correct cases are used only when gold labels are available; live deployment relies on observable risk signals.</w:t>
+        <w:t>The final page exports a Markdown feedback report and structured JSON or CSV files so the decision process can be inspected and reproduced.</w:t>
       </w:r>
     </w:p>
     <w:p>
@@ -1578,7 +1539,7 @@
           <w:rFonts w:ascii="Arial" w:hAnsi="Arial" w:eastAsia="Arial"/>
           <w:sz w:val="18"/>
         </w:rPr>
-        <w:t>Click Page 1: Home / System Overview.</w:t>
+        <w:t>Return to Page 1 or stay on Report Export.</w:t>
       </w:r>
     </w:p>
     <w:p>
@@ -1626,7 +1587,7 @@
           <w:rFonts w:ascii="Arial" w:hAnsi="Arial" w:eastAsia="Arial"/>
           <w:sz w:val="20"/>
         </w:rPr>
-        <w:t>ConsensusScope is not a truth oracle. It is a reliability layer that helps researchers and practitioners decide when a multi-LLM system should answer, warn, re-check, or route the case for human review.</w:t>
+        <w:t>ConsensusScope helps decide when AI feedback requires human review.</w:t>
       </w:r>
     </w:p>
     <w:p>
@@ -1682,7 +1643,7 @@
           <w:rFonts w:ascii="Arial" w:hAnsi="Arial" w:eastAsia="Arial"/>
           <w:sz w:val="20"/>
         </w:rPr>
-        <w:t>Do not claim that the system knows false consensus at deployment time.</w:t>
+        <w:t>Do not claim teacher-study or classroom annotation results that are not in the data.</w:t>
       </w:r>
     </w:p>
     <w:p>
@@ -1694,7 +1655,7 @@
           <w:rFonts w:ascii="Arial" w:hAnsi="Arial" w:eastAsia="Arial"/>
           <w:sz w:val="20"/>
         </w:rPr>
-        <w:t>Say clearly that offline diagnostic labels require gold labels.</w:t>
+        <w:t>Do not frame ConsensusScope as an automatic essay scorer or teacher replacement.</w:t>
       </w:r>
     </w:p>
     <w:p>
@@ -1706,7 +1667,7 @@
           <w:rFonts w:ascii="Arial" w:hAnsi="Arial" w:eastAsia="Arial"/>
           <w:sz w:val="20"/>
         </w:rPr>
-        <w:t>Do not frame the dynamic judge as a stronger model; frame it as risk stratification and review routing.</w:t>
+        <w:t>Keep auxiliary QA pages clearly secondary to the ESL literary-feedback workflow.</w:t>
       </w:r>
     </w:p>
     <w:sectPr>

</xml_diff>

<commit_message>
Add final demo video URL and submission assets  确认后端 API
</commit_message>
<xml_diff>
--- a/docs/ConsensusScope_EMNLP_demo_script_2min30_en.docx
+++ b/docs/ConsensusScope_EMNLP_demo_script_2min30_en.docx
@@ -14,7 +14,7 @@
           <w:color w:val="0B2545"/>
           <w:sz w:val="40"/>
         </w:rPr>
-        <w:t>ConsensusScope EMNLP Demo Screencast Script</w:t>
+        <w:t>ConsensusScope EMNLP Demo Recording Script</w:t>
       </w:r>
     </w:p>
     <w:p>
@@ -28,7 +28,27 @@
           <w:color w:val="555555"/>
           <w:sz w:val="22"/>
         </w:rPr>
-        <w:t>English version · 2 minutes 30 seconds · with screen actions</w:t>
+        <w:t>English narration · 2 minutes 30 seconds</w:t>
+      </w:r>
+    </w:p>
+    <w:p>
+      <w:pPr>
+        <w:spacing w:after="100"/>
+      </w:pPr>
+      <w:r>
+        <w:rPr>
+          <w:rFonts w:ascii="Arial" w:hAnsi="Arial" w:eastAsia="Arial"/>
+          <w:b/>
+          <w:sz w:val="20"/>
+        </w:rPr>
+        <w:t xml:space="preserve">Recording URL: </w:t>
+      </w:r>
+      <w:r>
+        <w:rPr>
+          <w:rFonts w:ascii="Arial" w:hAnsi="Arial" w:eastAsia="Arial"/>
+          <w:sz w:val="20"/>
+        </w:rPr>
+        <w:t>https://demo.consensusscope.cn/</w:t>
       </w:r>
     </w:p>
     <w:p>
@@ -68,7 +88,7 @@
           <w:rFonts w:ascii="Arial" w:hAnsi="Arial" w:eastAsia="Arial"/>
           <w:sz w:val="20"/>
         </w:rPr>
-        <w:t>AI writing feedback can be fluent but unsafe. ConsensusScope routes ESL comparative-literature feedback into low-risk auto-accept and teacher-review queues with literary knowledge evidence.</w:t>
+        <w:t>ConsensusScope reviews AI-generated ESL writing feedback before students see it; it is a teacher-in-the-loop routing tool, not an automatic essay scorer or teacher replacement.</w:t>
       </w:r>
     </w:p>
     <w:p>
@@ -76,7 +96,7 @@
         <w:pStyle w:val="Heading1"/>
       </w:pPr>
       <w:r>
-        <w:t>1. Page-by-page Recording Plan</w:t>
+        <w:t>1. One-Page Timeline</w:t>
       </w:r>
     </w:p>
     <w:tbl>
@@ -96,12 +116,12 @@
       <w:tr>
         <w:tc>
           <w:tcPr>
-            <w:tcW w:type="dxa" w:w="1152"/>
+            <w:tcW w:type="dxa" w:w="1008"/>
             <w:vAlign w:val="center"/>
             <w:tcMar>
-              <w:top w:w="80" w:type="dxa"/>
+              <w:top w:w="90" w:type="dxa"/>
               <w:start w:w="120" w:type="dxa"/>
-              <w:bottom w:w="80" w:type="dxa"/>
+              <w:bottom w:w="90" w:type="dxa"/>
               <w:end w:w="120" w:type="dxa"/>
             </w:tcMar>
             <w:shd w:fill="E8EEF5"/>
@@ -123,12 +143,12 @@
         </w:tc>
         <w:tc>
           <w:tcPr>
-            <w:tcW w:type="dxa" w:w="1872"/>
+            <w:tcW w:type="dxa" w:w="2232"/>
             <w:vAlign w:val="center"/>
             <w:tcMar>
-              <w:top w:w="80" w:type="dxa"/>
+              <w:top w:w="90" w:type="dxa"/>
               <w:start w:w="120" w:type="dxa"/>
-              <w:bottom w:w="80" w:type="dxa"/>
+              <w:bottom w:w="90" w:type="dxa"/>
               <w:end w:w="120" w:type="dxa"/>
             </w:tcMar>
             <w:shd w:fill="E8EEF5"/>
@@ -150,12 +170,12 @@
         </w:tc>
         <w:tc>
           <w:tcPr>
-            <w:tcW w:type="dxa" w:w="4176"/>
+            <w:tcW w:type="dxa" w:w="4536"/>
             <w:vAlign w:val="center"/>
             <w:tcMar>
-              <w:top w:w="80" w:type="dxa"/>
+              <w:top w:w="90" w:type="dxa"/>
               <w:start w:w="120" w:type="dxa"/>
-              <w:bottom w:w="80" w:type="dxa"/>
+              <w:bottom w:w="90" w:type="dxa"/>
               <w:end w:w="120" w:type="dxa"/>
             </w:tcMar>
             <w:shd w:fill="E8EEF5"/>
@@ -171,18 +191,18 @@
                 <w:b/>
                 <w:sz w:val="18"/>
               </w:rPr>
-              <w:t>Screen Action</w:t>
+              <w:t>Chinese screen operation</w:t>
             </w:r>
           </w:p>
         </w:tc>
         <w:tc>
           <w:tcPr>
-            <w:tcW w:type="dxa" w:w="1872"/>
+            <w:tcW w:type="dxa" w:w="1584"/>
             <w:vAlign w:val="center"/>
             <w:tcMar>
-              <w:top w:w="80" w:type="dxa"/>
+              <w:top w:w="90" w:type="dxa"/>
               <w:start w:w="120" w:type="dxa"/>
-              <w:bottom w:w="80" w:type="dxa"/>
+              <w:bottom w:w="90" w:type="dxa"/>
               <w:end w:w="120" w:type="dxa"/>
             </w:tcMar>
             <w:shd w:fill="E8EEF5"/>
@@ -198,7 +218,7 @@
                 <w:b/>
                 <w:sz w:val="18"/>
               </w:rPr>
-              <w:t>Narration Focus</w:t>
+              <w:t>English narration focus</w:t>
             </w:r>
           </w:p>
         </w:tc>
@@ -206,12 +226,12 @@
       <w:tr>
         <w:tc>
           <w:tcPr>
-            <w:tcW w:type="dxa" w:w="1152"/>
+            <w:tcW w:type="dxa" w:w="1008"/>
             <w:vAlign w:val="center"/>
             <w:tcMar>
-              <w:top w:w="80" w:type="dxa"/>
+              <w:top w:w="90" w:type="dxa"/>
               <w:start w:w="120" w:type="dxa"/>
-              <w:bottom w:w="80" w:type="dxa"/>
+              <w:bottom w:w="90" w:type="dxa"/>
               <w:end w:w="120" w:type="dxa"/>
             </w:tcMar>
           </w:tcPr>
@@ -232,12 +252,12 @@
         </w:tc>
         <w:tc>
           <w:tcPr>
-            <w:tcW w:type="dxa" w:w="1872"/>
+            <w:tcW w:type="dxa" w:w="2232"/>
             <w:vAlign w:val="center"/>
             <w:tcMar>
-              <w:top w:w="80" w:type="dxa"/>
+              <w:top w:w="90" w:type="dxa"/>
               <w:start w:w="120" w:type="dxa"/>
-              <w:bottom w:w="80" w:type="dxa"/>
+              <w:bottom w:w="90" w:type="dxa"/>
               <w:end w:w="120" w:type="dxa"/>
             </w:tcMar>
           </w:tcPr>
@@ -252,18 +272,48 @@
                 <w:b w:val="0"/>
                 <w:sz w:val="18"/>
               </w:rPr>
-              <w:t>Page 1</w:t>
+              <w:t>Problem / Page 1: Review Workspace</w:t>
             </w:r>
           </w:p>
         </w:tc>
         <w:tc>
           <w:tcPr>
-            <w:tcW w:type="dxa" w:w="4176"/>
+            <w:tcW w:type="dxa" w:w="4536"/>
             <w:vAlign w:val="center"/>
             <w:tcMar>
-              <w:top w:w="80" w:type="dxa"/>
+              <w:top w:w="90" w:type="dxa"/>
               <w:start w:w="120" w:type="dxa"/>
-              <w:bottom w:w="80" w:type="dxa"/>
+              <w:bottom w:w="90" w:type="dxa"/>
+              <w:end w:w="120" w:type="dxa"/>
+            </w:tcMar>
+          </w:tcPr>
+          <w:p>
+            <w:pPr>
+              <w:spacing w:after="0" w:line="259" w:lineRule="auto"/>
+            </w:pPr>
+            <w:r/>
+            <w:r>
+              <w:rPr>
+                <w:rFonts w:ascii="Arial" w:hAnsi="Arial" w:eastAsia="Arial"/>
+                <w:b w:val="0"/>
+                <w:sz w:val="16"/>
+              </w:rPr>
+              <w:t>打开 Page 1: Review Workspace。</w:t>
+              <w:br/>
+              <w:t>鼠标停在标题和顶部指标附近。</w:t>
+              <w:br/>
+              <w:t>指一下主流程：single essay, batch review, comparison, queue, evaluation, reports。</w:t>
+            </w:r>
+          </w:p>
+        </w:tc>
+        <w:tc>
+          <w:tcPr>
+            <w:tcW w:type="dxa" w:w="1584"/>
+            <w:vAlign w:val="center"/>
+            <w:tcMar>
+              <w:top w:w="90" w:type="dxa"/>
+              <w:start w:w="120" w:type="dxa"/>
+              <w:bottom w:w="90" w:type="dxa"/>
               <w:end w:w="120" w:type="dxa"/>
             </w:tcMar>
           </w:tcPr>
@@ -278,18 +328,20 @@
                 <w:b w:val="0"/>
                 <w:sz w:val="18"/>
               </w:rPr>
-              <w:t>Open Home / System Overview. Keep the pointer near the title and workflow.</w:t>
+              <w:t>AI writing feedback can be fluent but unsafe.</w:t>
             </w:r>
           </w:p>
         </w:tc>
+      </w:tr>
+      <w:tr>
         <w:tc>
           <w:tcPr>
-            <w:tcW w:type="dxa" w:w="1872"/>
+            <w:tcW w:type="dxa" w:w="1008"/>
             <w:vAlign w:val="center"/>
             <w:tcMar>
-              <w:top w:w="80" w:type="dxa"/>
+              <w:top w:w="90" w:type="dxa"/>
               <w:start w:w="120" w:type="dxa"/>
-              <w:bottom w:w="80" w:type="dxa"/>
+              <w:bottom w:w="90" w:type="dxa"/>
               <w:end w:w="120" w:type="dxa"/>
             </w:tcMar>
           </w:tcPr>
@@ -304,20 +356,18 @@
                 <w:b w:val="0"/>
                 <w:sz w:val="18"/>
               </w:rPr>
-              <w:t>Problem and premise</w:t>
+              <w:t>0:20-0:50</w:t>
             </w:r>
           </w:p>
         </w:tc>
-      </w:tr>
-      <w:tr>
         <w:tc>
           <w:tcPr>
-            <w:tcW w:type="dxa" w:w="1152"/>
+            <w:tcW w:type="dxa" w:w="2232"/>
             <w:vAlign w:val="center"/>
             <w:tcMar>
-              <w:top w:w="80" w:type="dxa"/>
+              <w:top w:w="90" w:type="dxa"/>
               <w:start w:w="120" w:type="dxa"/>
-              <w:bottom w:w="80" w:type="dxa"/>
+              <w:bottom w:w="90" w:type="dxa"/>
               <w:end w:w="120" w:type="dxa"/>
             </w:tcMar>
           </w:tcPr>
@@ -332,18 +382,52 @@
                 <w:b w:val="0"/>
                 <w:sz w:val="18"/>
               </w:rPr>
-              <w:t>0:20-0:45</w:t>
+              <w:t>Page 2: Single Essay Review</w:t>
             </w:r>
           </w:p>
         </w:tc>
         <w:tc>
           <w:tcPr>
-            <w:tcW w:type="dxa" w:w="1872"/>
+            <w:tcW w:type="dxa" w:w="4536"/>
             <w:vAlign w:val="center"/>
             <w:tcMar>
-              <w:top w:w="80" w:type="dxa"/>
+              <w:top w:w="90" w:type="dxa"/>
               <w:start w:w="120" w:type="dxa"/>
-              <w:bottom w:w="80" w:type="dxa"/>
+              <w:bottom w:w="90" w:type="dxa"/>
+              <w:end w:w="120" w:type="dxa"/>
+            </w:tcMar>
+          </w:tcPr>
+          <w:p>
+            <w:pPr>
+              <w:spacing w:after="0" w:line="259" w:lineRule="auto"/>
+            </w:pPr>
+            <w:r/>
+            <w:r>
+              <w:rPr>
+                <w:rFonts w:ascii="Arial" w:hAnsi="Arial" w:eastAsia="Arial"/>
+                <w:b w:val="0"/>
+                <w:sz w:val="16"/>
+              </w:rPr>
+              <w:t>点击 Page 2: Single Essay Review。</w:t>
+              <w:br/>
+              <w:t>选择内置 demo essay。</w:t>
+              <w:br/>
+              <w:t>展示 assignment prompt、essay text、reviewer settings。</w:t>
+              <w:br/>
+              <w:t>如果页面已有 routed feedback，就直接展示；如果没有，点击生成/路由按钮。</w:t>
+              <w:br/>
+              <w:t>指向 auto-accepted items、teacher-review items、risk score、evidence signal、review explanation。</w:t>
+            </w:r>
+          </w:p>
+        </w:tc>
+        <w:tc>
+          <w:tcPr>
+            <w:tcW w:type="dxa" w:w="1584"/>
+            <w:vAlign w:val="center"/>
+            <w:tcMar>
+              <w:top w:w="90" w:type="dxa"/>
+              <w:start w:w="120" w:type="dxa"/>
+              <w:bottom w:w="90" w:type="dxa"/>
               <w:end w:w="120" w:type="dxa"/>
             </w:tcMar>
           </w:tcPr>
@@ -358,18 +442,20 @@
                 <w:b w:val="0"/>
                 <w:sz w:val="18"/>
               </w:rPr>
-              <w:t>Page 2</w:t>
+              <w:t>In the single essay window, a teacher can paste an ESL draft, provide the assignment prompt, and generate AI-style feedback candidates.</w:t>
             </w:r>
           </w:p>
         </w:tc>
+      </w:tr>
+      <w:tr>
         <w:tc>
           <w:tcPr>
-            <w:tcW w:type="dxa" w:w="4176"/>
+            <w:tcW w:type="dxa" w:w="1008"/>
             <w:vAlign w:val="center"/>
             <w:tcMar>
-              <w:top w:w="80" w:type="dxa"/>
+              <w:top w:w="90" w:type="dxa"/>
               <w:start w:w="120" w:type="dxa"/>
-              <w:bottom w:w="80" w:type="dxa"/>
+              <w:bottom w:w="90" w:type="dxa"/>
               <w:end w:w="120" w:type="dxa"/>
             </w:tcMar>
           </w:tcPr>
@@ -384,18 +470,18 @@
                 <w:b w:val="0"/>
                 <w:sz w:val="18"/>
               </w:rPr>
-              <w:t>Click ESL Feedback Review. Show the essay input and reviewer source selector.</w:t>
+              <w:t>0:50-1:10</w:t>
             </w:r>
           </w:p>
         </w:tc>
         <w:tc>
           <w:tcPr>
-            <w:tcW w:type="dxa" w:w="1872"/>
+            <w:tcW w:type="dxa" w:w="2232"/>
             <w:vAlign w:val="center"/>
             <w:tcMar>
-              <w:top w:w="80" w:type="dxa"/>
+              <w:top w:w="90" w:type="dxa"/>
               <w:start w:w="120" w:type="dxa"/>
-              <w:bottom w:w="80" w:type="dxa"/>
+              <w:bottom w:w="90" w:type="dxa"/>
               <w:end w:w="120" w:type="dxa"/>
             </w:tcMar>
           </w:tcPr>
@@ -410,20 +496,50 @@
                 <w:b w:val="0"/>
                 <w:sz w:val="18"/>
               </w:rPr>
-              <w:t>System overview</w:t>
+              <w:t>Page 3: Batch Review</w:t>
             </w:r>
           </w:p>
         </w:tc>
-      </w:tr>
-      <w:tr>
         <w:tc>
           <w:tcPr>
-            <w:tcW w:type="dxa" w:w="1152"/>
+            <w:tcW w:type="dxa" w:w="4536"/>
             <w:vAlign w:val="center"/>
             <w:tcMar>
-              <w:top w:w="80" w:type="dxa"/>
+              <w:top w:w="90" w:type="dxa"/>
               <w:start w:w="120" w:type="dxa"/>
-              <w:bottom w:w="80" w:type="dxa"/>
+              <w:bottom w:w="90" w:type="dxa"/>
+              <w:end w:w="120" w:type="dxa"/>
+            </w:tcMar>
+          </w:tcPr>
+          <w:p>
+            <w:pPr>
+              <w:spacing w:after="0" w:line="259" w:lineRule="auto"/>
+            </w:pPr>
+            <w:r/>
+            <w:r>
+              <w:rPr>
+                <w:rFonts w:ascii="Arial" w:hAnsi="Arial" w:eastAsia="Arial"/>
+                <w:b w:val="0"/>
+                <w:sz w:val="16"/>
+              </w:rPr>
+              <w:t>点击 Page 3: Batch Review。</w:t>
+              <w:br/>
+              <w:t>展示 packaged synthetic CSV / sample data。</w:t>
+              <w:br/>
+              <w:t>展示 batch summary table 和 routed feedback export。</w:t>
+              <w:br/>
+              <w:t>不需要上传真实文件。</w:t>
+            </w:r>
+          </w:p>
+        </w:tc>
+        <w:tc>
+          <w:tcPr>
+            <w:tcW w:type="dxa" w:w="1584"/>
+            <w:vAlign w:val="center"/>
+            <w:tcMar>
+              <w:top w:w="90" w:type="dxa"/>
+              <w:start w:w="120" w:type="dxa"/>
+              <w:bottom w:w="90" w:type="dxa"/>
               <w:end w:w="120" w:type="dxa"/>
             </w:tcMar>
           </w:tcPr>
@@ -438,18 +554,20 @@
                 <w:b w:val="0"/>
                 <w:sz w:val="18"/>
               </w:rPr>
-              <w:t>0:45-1:10</w:t>
+              <w:t>The batch window supports the practical classroom workflow: multiple essays can be processed from a CSV, then exported as routed feedback for teacher triage.</w:t>
             </w:r>
           </w:p>
         </w:tc>
+      </w:tr>
+      <w:tr>
         <w:tc>
           <w:tcPr>
-            <w:tcW w:type="dxa" w:w="1872"/>
+            <w:tcW w:type="dxa" w:w="1008"/>
             <w:vAlign w:val="center"/>
             <w:tcMar>
-              <w:top w:w="80" w:type="dxa"/>
+              <w:top w:w="90" w:type="dxa"/>
               <w:start w:w="120" w:type="dxa"/>
-              <w:bottom w:w="80" w:type="dxa"/>
+              <w:bottom w:w="90" w:type="dxa"/>
               <w:end w:w="120" w:type="dxa"/>
             </w:tcMar>
           </w:tcPr>
@@ -464,18 +582,18 @@
                 <w:b w:val="0"/>
                 <w:sz w:val="18"/>
               </w:rPr>
-              <w:t>Page 2</w:t>
+              <w:t>1:10-1:30</w:t>
             </w:r>
           </w:p>
         </w:tc>
         <w:tc>
           <w:tcPr>
-            <w:tcW w:type="dxa" w:w="4176"/>
+            <w:tcW w:type="dxa" w:w="2232"/>
             <w:vAlign w:val="center"/>
             <w:tcMar>
-              <w:top w:w="80" w:type="dxa"/>
+              <w:top w:w="90" w:type="dxa"/>
               <w:start w:w="120" w:type="dxa"/>
-              <w:bottom w:w="80" w:type="dxa"/>
+              <w:bottom w:w="90" w:type="dxa"/>
               <w:end w:w="120" w:type="dxa"/>
             </w:tcMar>
           </w:tcPr>
@@ -490,18 +608,48 @@
                 <w:b w:val="0"/>
                 <w:sz w:val="18"/>
               </w:rPr>
-              <w:t>Run the no-API demo and open Knowledge Evidence.</w:t>
+              <w:t>Page 4: AI Feedback Comparison</w:t>
             </w:r>
           </w:p>
         </w:tc>
         <w:tc>
           <w:tcPr>
-            <w:tcW w:type="dxa" w:w="1872"/>
+            <w:tcW w:type="dxa" w:w="4536"/>
             <w:vAlign w:val="center"/>
             <w:tcMar>
-              <w:top w:w="80" w:type="dxa"/>
+              <w:top w:w="90" w:type="dxa"/>
               <w:start w:w="120" w:type="dxa"/>
-              <w:bottom w:w="80" w:type="dxa"/>
+              <w:bottom w:w="90" w:type="dxa"/>
+              <w:end w:w="120" w:type="dxa"/>
+            </w:tcMar>
+          </w:tcPr>
+          <w:p>
+            <w:pPr>
+              <w:spacing w:after="0" w:line="259" w:lineRule="auto"/>
+            </w:pPr>
+            <w:r/>
+            <w:r>
+              <w:rPr>
+                <w:rFonts w:ascii="Arial" w:hAnsi="Arial" w:eastAsia="Arial"/>
+                <w:b w:val="0"/>
+                <w:sz w:val="16"/>
+              </w:rPr>
+              <w:t>点击 Page 4: AI Feedback Comparison。</w:t>
+              <w:br/>
+              <w:t>指向按 target span 和 issue type 对齐的反馈。</w:t>
+              <w:br/>
+              <w:t>指向 risk level / consensus state / review routing 相关列。</w:t>
+            </w:r>
+          </w:p>
+        </w:tc>
+        <w:tc>
+          <w:tcPr>
+            <w:tcW w:type="dxa" w:w="1584"/>
+            <w:vAlign w:val="center"/>
+            <w:tcMar>
+              <w:top w:w="90" w:type="dxa"/>
+              <w:start w:w="120" w:type="dxa"/>
+              <w:bottom w:w="90" w:type="dxa"/>
               <w:end w:w="120" w:type="dxa"/>
             </w:tcMar>
           </w:tcPr>
@@ -516,7 +664,7 @@
                 <w:b w:val="0"/>
                 <w:sz w:val="18"/>
               </w:rPr>
-              <w:t>Knowledge grounding</w:t>
+              <w:t>The comparison page makes model disagreement visible.</w:t>
             </w:r>
           </w:p>
         </w:tc>
@@ -524,12 +672,12 @@
       <w:tr>
         <w:tc>
           <w:tcPr>
-            <w:tcW w:type="dxa" w:w="1152"/>
+            <w:tcW w:type="dxa" w:w="1008"/>
             <w:vAlign w:val="center"/>
             <w:tcMar>
-              <w:top w:w="80" w:type="dxa"/>
+              <w:top w:w="90" w:type="dxa"/>
               <w:start w:w="120" w:type="dxa"/>
-              <w:bottom w:w="80" w:type="dxa"/>
+              <w:bottom w:w="90" w:type="dxa"/>
               <w:end w:w="120" w:type="dxa"/>
             </w:tcMar>
           </w:tcPr>
@@ -544,18 +692,18 @@
                 <w:b w:val="0"/>
                 <w:sz w:val="18"/>
               </w:rPr>
-              <w:t>1:10-1:40</w:t>
+              <w:t>1:30-2:00</w:t>
             </w:r>
           </w:p>
         </w:tc>
         <w:tc>
           <w:tcPr>
-            <w:tcW w:type="dxa" w:w="1872"/>
+            <w:tcW w:type="dxa" w:w="2232"/>
             <w:vAlign w:val="center"/>
             <w:tcMar>
-              <w:top w:w="80" w:type="dxa"/>
+              <w:top w:w="90" w:type="dxa"/>
               <w:start w:w="120" w:type="dxa"/>
-              <w:bottom w:w="80" w:type="dxa"/>
+              <w:bottom w:w="90" w:type="dxa"/>
               <w:end w:w="120" w:type="dxa"/>
             </w:tcMar>
           </w:tcPr>
@@ -570,18 +718,50 @@
                 <w:b w:val="0"/>
                 <w:sz w:val="18"/>
               </w:rPr>
-              <w:t>Page 2/3</w:t>
+              <w:t>Page 5: Teacher Queue</w:t>
             </w:r>
           </w:p>
         </w:tc>
         <w:tc>
           <w:tcPr>
-            <w:tcW w:type="dxa" w:w="4176"/>
+            <w:tcW w:type="dxa" w:w="4536"/>
             <w:vAlign w:val="center"/>
             <w:tcMar>
-              <w:top w:w="80" w:type="dxa"/>
+              <w:top w:w="90" w:type="dxa"/>
               <w:start w:w="120" w:type="dxa"/>
-              <w:bottom w:w="80" w:type="dxa"/>
+              <w:bottom w:w="90" w:type="dxa"/>
+              <w:end w:w="120" w:type="dxa"/>
+            </w:tcMar>
+          </w:tcPr>
+          <w:p>
+            <w:pPr>
+              <w:spacing w:after="0" w:line="259" w:lineRule="auto"/>
+            </w:pPr>
+            <w:r/>
+            <w:r>
+              <w:rPr>
+                <w:rFonts w:ascii="Arial" w:hAnsi="Arial" w:eastAsia="Arial"/>
+                <w:b w:val="0"/>
+                <w:sz w:val="16"/>
+              </w:rPr>
+              <w:t>点击 Page 5: Teacher Queue。</w:t>
+              <w:br/>
+              <w:t>停在一个 high-risk item 上，例如 meaning change 或 unsupported claim。</w:t>
+              <w:br/>
+              <w:t>指向 Feedback Safety Graph path、review confidence、evidence signal、priority、explanation。</w:t>
+              <w:br/>
+              <w:t>如果页面有 action 控件，可以选择或展示一个 teacher action。</w:t>
+            </w:r>
+          </w:p>
+        </w:tc>
+        <w:tc>
+          <w:tcPr>
+            <w:tcW w:type="dxa" w:w="1584"/>
+            <w:vAlign w:val="center"/>
+            <w:tcMar>
+              <w:top w:w="90" w:type="dxa"/>
+              <w:start w:w="120" w:type="dxa"/>
+              <w:bottom w:w="90" w:type="dxa"/>
               <w:end w:w="120" w:type="dxa"/>
             </w:tcMar>
           </w:tcPr>
@@ -596,18 +776,20 @@
                 <w:b w:val="0"/>
                 <w:sz w:val="18"/>
               </w:rPr>
-              <w:t>Show Teacher View, Adjudication Trace, then Knowledge Grounding &amp; Teacher Queue.</w:t>
+              <w:t>The teacher queue prioritizes high-risk feedback first.</w:t>
             </w:r>
           </w:p>
         </w:tc>
+      </w:tr>
+      <w:tr>
         <w:tc>
           <w:tcPr>
-            <w:tcW w:type="dxa" w:w="1872"/>
+            <w:tcW w:type="dxa" w:w="1008"/>
             <w:vAlign w:val="center"/>
             <w:tcMar>
-              <w:top w:w="80" w:type="dxa"/>
+              <w:top w:w="90" w:type="dxa"/>
               <w:start w:w="120" w:type="dxa"/>
-              <w:bottom w:w="80" w:type="dxa"/>
+              <w:bottom w:w="90" w:type="dxa"/>
               <w:end w:w="120" w:type="dxa"/>
             </w:tcMar>
           </w:tcPr>
@@ -622,20 +804,18 @@
                 <w:b w:val="0"/>
                 <w:sz w:val="18"/>
               </w:rPr>
-              <w:t>Feedback routing</w:t>
+              <w:t>2:00-2:20</w:t>
             </w:r>
           </w:p>
         </w:tc>
-      </w:tr>
-      <w:tr>
         <w:tc>
           <w:tcPr>
-            <w:tcW w:type="dxa" w:w="1152"/>
+            <w:tcW w:type="dxa" w:w="2232"/>
             <w:vAlign w:val="center"/>
             <w:tcMar>
-              <w:top w:w="80" w:type="dxa"/>
+              <w:top w:w="90" w:type="dxa"/>
               <w:start w:w="120" w:type="dxa"/>
-              <w:bottom w:w="80" w:type="dxa"/>
+              <w:bottom w:w="90" w:type="dxa"/>
               <w:end w:w="120" w:type="dxa"/>
             </w:tcMar>
           </w:tcPr>
@@ -650,18 +830,50 @@
                 <w:b w:val="0"/>
                 <w:sz w:val="18"/>
               </w:rPr>
-              <w:t>1:40-2:05</w:t>
+              <w:t>Page 6: Effectiveness Evaluation</w:t>
             </w:r>
           </w:p>
         </w:tc>
         <w:tc>
           <w:tcPr>
-            <w:tcW w:type="dxa" w:w="1872"/>
+            <w:tcW w:type="dxa" w:w="4536"/>
             <w:vAlign w:val="center"/>
             <w:tcMar>
-              <w:top w:w="80" w:type="dxa"/>
+              <w:top w:w="90" w:type="dxa"/>
               <w:start w:w="120" w:type="dxa"/>
-              <w:bottom w:w="80" w:type="dxa"/>
+              <w:bottom w:w="90" w:type="dxa"/>
+              <w:end w:w="120" w:type="dxa"/>
+            </w:tcMar>
+          </w:tcPr>
+          <w:p>
+            <w:pPr>
+              <w:spacing w:after="0" w:line="259" w:lineRule="auto"/>
+            </w:pPr>
+            <w:r/>
+            <w:r>
+              <w:rPr>
+                <w:rFonts w:ascii="Arial" w:hAnsi="Arial" w:eastAsia="Arial"/>
+                <w:b w:val="0"/>
+                <w:sz w:val="16"/>
+              </w:rPr>
+              <w:t>点击 Page 6: Effectiveness Evaluation。</w:t>
+              <w:br/>
+              <w:t>指向 action accuracy、risk accuracy、high-risk recall、review recall、auto-accept precision。</w:t>
+              <w:br/>
+              <w:t>如页面有公开学习者语料 benchmark 表，指向 auto share、review share、errors reviewed。</w:t>
+              <w:br/>
+              <w:t>点击 Page 7: Reports，展示 report preview 和 export buttons。</w:t>
+            </w:r>
+          </w:p>
+        </w:tc>
+        <w:tc>
+          <w:tcPr>
+            <w:tcW w:type="dxa" w:w="1584"/>
+            <w:vAlign w:val="center"/>
+            <w:tcMar>
+              <w:top w:w="90" w:type="dxa"/>
+              <w:start w:w="120" w:type="dxa"/>
+              <w:bottom w:w="90" w:type="dxa"/>
               <w:end w:w="120" w:type="dxa"/>
             </w:tcMar>
           </w:tcPr>
@@ -676,18 +888,20 @@
                 <w:b w:val="0"/>
                 <w:sz w:val="18"/>
               </w:rPr>
-              <w:t>Page 3</w:t>
+              <w:t>The evaluation page separates two kinds of evidence.</w:t>
             </w:r>
           </w:p>
         </w:tc>
+      </w:tr>
+      <w:tr>
         <w:tc>
           <w:tcPr>
-            <w:tcW w:type="dxa" w:w="4176"/>
+            <w:tcW w:type="dxa" w:w="1008"/>
             <w:vAlign w:val="center"/>
             <w:tcMar>
-              <w:top w:w="80" w:type="dxa"/>
+              <w:top w:w="90" w:type="dxa"/>
               <w:start w:w="120" w:type="dxa"/>
-              <w:bottom w:w="80" w:type="dxa"/>
+              <w:bottom w:w="90" w:type="dxa"/>
               <w:end w:w="120" w:type="dxa"/>
             </w:tcMar>
           </w:tcPr>
@@ -702,18 +916,18 @@
                 <w:b w:val="0"/>
                 <w:sz w:val="18"/>
               </w:rPr>
-              <w:t>Point to risk level, priority, model agreement, and KG support.</w:t>
+              <w:t>2:20-2:30</w:t>
             </w:r>
           </w:p>
         </w:tc>
         <w:tc>
           <w:tcPr>
-            <w:tcW w:type="dxa" w:w="1872"/>
+            <w:tcW w:type="dxa" w:w="2232"/>
             <w:vAlign w:val="center"/>
             <w:tcMar>
-              <w:top w:w="80" w:type="dxa"/>
+              <w:top w:w="90" w:type="dxa"/>
               <w:start w:w="120" w:type="dxa"/>
-              <w:bottom w:w="80" w:type="dxa"/>
+              <w:bottom w:w="90" w:type="dxa"/>
               <w:end w:w="120" w:type="dxa"/>
             </w:tcMar>
           </w:tcPr>
@@ -728,20 +942,46 @@
                 <w:b w:val="0"/>
                 <w:sz w:val="18"/>
               </w:rPr>
-              <w:t>Teacher review queue</w:t>
+              <w:t>Page 7: Reports</w:t>
             </w:r>
           </w:p>
         </w:tc>
-      </w:tr>
-      <w:tr>
         <w:tc>
           <w:tcPr>
-            <w:tcW w:type="dxa" w:w="1152"/>
+            <w:tcW w:type="dxa" w:w="4536"/>
             <w:vAlign w:val="center"/>
             <w:tcMar>
-              <w:top w:w="80" w:type="dxa"/>
+              <w:top w:w="90" w:type="dxa"/>
               <w:start w:w="120" w:type="dxa"/>
-              <w:bottom w:w="80" w:type="dxa"/>
+              <w:bottom w:w="90" w:type="dxa"/>
+              <w:end w:w="120" w:type="dxa"/>
+            </w:tcMar>
+          </w:tcPr>
+          <w:p>
+            <w:pPr>
+              <w:spacing w:after="0" w:line="259" w:lineRule="auto"/>
+            </w:pPr>
+            <w:r/>
+            <w:r>
+              <w:rPr>
+                <w:rFonts w:ascii="Arial" w:hAnsi="Arial" w:eastAsia="Arial"/>
+                <w:b w:val="0"/>
+                <w:sz w:val="16"/>
+              </w:rPr>
+              <w:t>停在 Reports 或返回 Page 1。</w:t>
+              <w:br/>
+              <w:t>鼠标不要动，留 1 秒安静收尾。</w:t>
+            </w:r>
+          </w:p>
+        </w:tc>
+        <w:tc>
+          <w:tcPr>
+            <w:tcW w:type="dxa" w:w="1584"/>
+            <w:vAlign w:val="center"/>
+            <w:tcMar>
+              <w:top w:w="90" w:type="dxa"/>
+              <w:start w:w="120" w:type="dxa"/>
+              <w:bottom w:w="90" w:type="dxa"/>
               <w:end w:w="120" w:type="dxa"/>
             </w:tcMar>
           </w:tcPr>
@@ -756,191 +996,7 @@
                 <w:b w:val="0"/>
                 <w:sz w:val="18"/>
               </w:rPr>
-              <w:t>2:05-2:25</w:t>
-            </w:r>
-          </w:p>
-        </w:tc>
-        <w:tc>
-          <w:tcPr>
-            <w:tcW w:type="dxa" w:w="1872"/>
-            <w:vAlign w:val="center"/>
-            <w:tcMar>
-              <w:top w:w="80" w:type="dxa"/>
-              <w:start w:w="120" w:type="dxa"/>
-              <w:bottom w:w="80" w:type="dxa"/>
-              <w:end w:w="120" w:type="dxa"/>
-            </w:tcMar>
-          </w:tcPr>
-          <w:p>
-            <w:pPr>
-              <w:spacing w:after="0" w:line="259" w:lineRule="auto"/>
-            </w:pPr>
-            <w:r/>
-            <w:r>
-              <w:rPr>
-                <w:rFonts w:ascii="Arial" w:hAnsi="Arial" w:eastAsia="Arial"/>
-                <w:b w:val="0"/>
-                <w:sz w:val="18"/>
-              </w:rPr>
-              <w:t>Page 8</w:t>
-            </w:r>
-          </w:p>
-        </w:tc>
-        <w:tc>
-          <w:tcPr>
-            <w:tcW w:type="dxa" w:w="4176"/>
-            <w:vAlign w:val="center"/>
-            <w:tcMar>
-              <w:top w:w="80" w:type="dxa"/>
-              <w:start w:w="120" w:type="dxa"/>
-              <w:bottom w:w="80" w:type="dxa"/>
-              <w:end w:w="120" w:type="dxa"/>
-            </w:tcMar>
-          </w:tcPr>
-          <w:p>
-            <w:pPr>
-              <w:spacing w:after="0" w:line="259" w:lineRule="auto"/>
-            </w:pPr>
-            <w:r/>
-            <w:r>
-              <w:rPr>
-                <w:rFonts w:ascii="Arial" w:hAnsi="Arial" w:eastAsia="Arial"/>
-                <w:b w:val="0"/>
-                <w:sz w:val="18"/>
-              </w:rPr>
-              <w:t>Click Report Export and show the report download buttons.</w:t>
-            </w:r>
-          </w:p>
-        </w:tc>
-        <w:tc>
-          <w:tcPr>
-            <w:tcW w:type="dxa" w:w="1872"/>
-            <w:vAlign w:val="center"/>
-            <w:tcMar>
-              <w:top w:w="80" w:type="dxa"/>
-              <w:start w:w="120" w:type="dxa"/>
-              <w:bottom w:w="80" w:type="dxa"/>
-              <w:end w:w="120" w:type="dxa"/>
-            </w:tcMar>
-          </w:tcPr>
-          <w:p>
-            <w:pPr>
-              <w:spacing w:after="0" w:line="259" w:lineRule="auto"/>
-            </w:pPr>
-            <w:r/>
-            <w:r>
-              <w:rPr>
-                <w:rFonts w:ascii="Arial" w:hAnsi="Arial" w:eastAsia="Arial"/>
-                <w:b w:val="0"/>
-                <w:sz w:val="18"/>
-              </w:rPr>
-              <w:t>Export</w:t>
-            </w:r>
-          </w:p>
-        </w:tc>
-      </w:tr>
-      <w:tr>
-        <w:tc>
-          <w:tcPr>
-            <w:tcW w:type="dxa" w:w="1152"/>
-            <w:vAlign w:val="center"/>
-            <w:tcMar>
-              <w:top w:w="80" w:type="dxa"/>
-              <w:start w:w="120" w:type="dxa"/>
-              <w:bottom w:w="80" w:type="dxa"/>
-              <w:end w:w="120" w:type="dxa"/>
-            </w:tcMar>
-          </w:tcPr>
-          <w:p>
-            <w:pPr>
-              <w:spacing w:after="0" w:line="259" w:lineRule="auto"/>
-            </w:pPr>
-            <w:r/>
-            <w:r>
-              <w:rPr>
-                <w:rFonts w:ascii="Arial" w:hAnsi="Arial" w:eastAsia="Arial"/>
-                <w:b w:val="0"/>
-                <w:sz w:val="18"/>
-              </w:rPr>
-              <w:t>2:25-2:30</w:t>
-            </w:r>
-          </w:p>
-        </w:tc>
-        <w:tc>
-          <w:tcPr>
-            <w:tcW w:type="dxa" w:w="1872"/>
-            <w:vAlign w:val="center"/>
-            <w:tcMar>
-              <w:top w:w="80" w:type="dxa"/>
-              <w:start w:w="120" w:type="dxa"/>
-              <w:bottom w:w="80" w:type="dxa"/>
-              <w:end w:w="120" w:type="dxa"/>
-            </w:tcMar>
-          </w:tcPr>
-          <w:p>
-            <w:pPr>
-              <w:spacing w:after="0" w:line="259" w:lineRule="auto"/>
-            </w:pPr>
-            <w:r/>
-            <w:r>
-              <w:rPr>
-                <w:rFonts w:ascii="Arial" w:hAnsi="Arial" w:eastAsia="Arial"/>
-                <w:b w:val="0"/>
-                <w:sz w:val="18"/>
-              </w:rPr>
-              <w:t>Page 1/8</w:t>
-            </w:r>
-          </w:p>
-        </w:tc>
-        <w:tc>
-          <w:tcPr>
-            <w:tcW w:type="dxa" w:w="4176"/>
-            <w:vAlign w:val="center"/>
-            <w:tcMar>
-              <w:top w:w="80" w:type="dxa"/>
-              <w:start w:w="120" w:type="dxa"/>
-              <w:bottom w:w="80" w:type="dxa"/>
-              <w:end w:w="120" w:type="dxa"/>
-            </w:tcMar>
-          </w:tcPr>
-          <w:p>
-            <w:pPr>
-              <w:spacing w:after="0" w:line="259" w:lineRule="auto"/>
-            </w:pPr>
-            <w:r/>
-            <w:r>
-              <w:rPr>
-                <w:rFonts w:ascii="Arial" w:hAnsi="Arial" w:eastAsia="Arial"/>
-                <w:b w:val="0"/>
-                <w:sz w:val="18"/>
-              </w:rPr>
-              <w:t>Stop moving the mouse and close with one sentence.</w:t>
-            </w:r>
-          </w:p>
-        </w:tc>
-        <w:tc>
-          <w:tcPr>
-            <w:tcW w:type="dxa" w:w="1872"/>
-            <w:vAlign w:val="center"/>
-            <w:tcMar>
-              <w:top w:w="80" w:type="dxa"/>
-              <w:start w:w="120" w:type="dxa"/>
-              <w:bottom w:w="80" w:type="dxa"/>
-              <w:end w:w="120" w:type="dxa"/>
-            </w:tcMar>
-          </w:tcPr>
-          <w:p>
-            <w:pPr>
-              <w:spacing w:after="0" w:line="259" w:lineRule="auto"/>
-            </w:pPr>
-            <w:r/>
-            <w:r>
-              <w:rPr>
-                <w:rFonts w:ascii="Arial" w:hAnsi="Arial" w:eastAsia="Arial"/>
-                <w:b w:val="0"/>
-                <w:sz w:val="18"/>
-              </w:rPr>
-              <w:t>Conclusion</w:t>
+              <w:t>ConsensusScope turns AI feedback into a reviewable teaching workflow: generate, compare, route, review, and export.</w:t>
             </w:r>
           </w:p>
         </w:tc>
@@ -952,7 +1008,7 @@
         <w:pStyle w:val="Heading1"/>
       </w:pPr>
       <w:r>
-        <w:t>2. Full English Narration Script</w:t>
+        <w:t>2. Read-Aloud Script</w:t>
       </w:r>
     </w:p>
     <w:p>
@@ -965,7 +1021,7 @@
           <w:b/>
           <w:sz w:val="24"/>
         </w:rPr>
-        <w:t>0:00-0:20  Opening</w:t>
+        <w:t>0:00-0:20  Problem / Page 1: Review Workspace</w:t>
       </w:r>
     </w:p>
     <w:p>
@@ -978,7 +1034,7 @@
           <w:b/>
           <w:sz w:val="20"/>
         </w:rPr>
-        <w:t>Screen actions:</w:t>
+        <w:t>屏幕操作（中文，录屏时照做）</w:t>
       </w:r>
     </w:p>
     <w:p>
@@ -991,7 +1047,7 @@
           <w:rFonts w:ascii="Arial" w:hAnsi="Arial" w:eastAsia="Arial"/>
           <w:sz w:val="18"/>
         </w:rPr>
-        <w:t>Click Page 1: Home / System Overview in the sidebar.</w:t>
+        <w:t>打开 Page 1: Review Workspace。</w:t>
       </w:r>
     </w:p>
     <w:p>
@@ -1004,7 +1060,7 @@
           <w:rFonts w:ascii="Arial" w:hAnsi="Arial" w:eastAsia="Arial"/>
           <w:sz w:val="18"/>
         </w:rPr>
-        <w:t>Keep the pointer near the title ConsensusScope.</w:t>
+        <w:t>鼠标停在标题和顶部指标附近。</w:t>
       </w:r>
     </w:p>
     <w:p>
@@ -1017,12 +1073,12 @@
           <w:rFonts w:ascii="Arial" w:hAnsi="Arial" w:eastAsia="Arial"/>
           <w:sz w:val="18"/>
         </w:rPr>
-        <w:t>Briefly move the pointer over the system pipeline.</w:t>
+        <w:t>指一下主流程：single essay, batch review, comparison, queue, evaluation, reports。</w:t>
       </w:r>
     </w:p>
     <w:p>
       <w:pPr>
-        <w:spacing w:before="40" w:after="160"/>
+        <w:spacing w:before="60" w:after="160"/>
         <w:ind w:left="216" w:right="72"/>
         <w:shd w:fill="F4F6F9"/>
       </w:pPr>
@@ -1032,14 +1088,14 @@
           <w:b/>
           <w:sz w:val="20"/>
         </w:rPr>
-        <w:t xml:space="preserve">Narration: </w:t>
+        <w:t xml:space="preserve">English narration: </w:t>
       </w:r>
       <w:r>
         <w:rPr>
           <w:rFonts w:ascii="Arial" w:hAnsi="Arial" w:eastAsia="Arial"/>
           <w:sz w:val="20"/>
         </w:rPr>
-        <w:t>AI writing feedback can be fluent but unsafe. In ESL comparative-literature essays, a model may fix grammar correctly while changing literary facts, character relations, or the student's interpretation.</w:t>
+        <w:t>AI writing feedback can be fluent but unsafe. A model may fix a local grammar issue while also changing a student's intended meaning, adding unsupported content, or overcorrecting a reasonable ESL draft.</w:t>
       </w:r>
     </w:p>
     <w:p>
@@ -1052,7 +1108,7 @@
           <w:b/>
           <w:sz w:val="24"/>
         </w:rPr>
-        <w:t>0:20-0:45  System overview</w:t>
+        <w:t>0:20-0:50  Page 2: Single Essay Review</w:t>
       </w:r>
     </w:p>
     <w:p>
@@ -1065,7 +1121,7 @@
           <w:b/>
           <w:sz w:val="20"/>
         </w:rPr>
-        <w:t>Screen actions:</w:t>
+        <w:t>屏幕操作（中文，录屏时照做）</w:t>
       </w:r>
     </w:p>
     <w:p>
@@ -1078,7 +1134,7 @@
           <w:rFonts w:ascii="Arial" w:hAnsi="Arial" w:eastAsia="Arial"/>
           <w:sz w:val="18"/>
         </w:rPr>
-        <w:t>Move to the sidebar API Configuration panel.</w:t>
+        <w:t>点击 Page 2: Single Essay Review。</w:t>
       </w:r>
     </w:p>
     <w:p>
@@ -1091,7 +1147,7 @@
           <w:rFonts w:ascii="Arial" w:hAnsi="Arial" w:eastAsia="Arial"/>
           <w:sz w:val="18"/>
         </w:rPr>
-        <w:t>Show Mode A and Mode B without typing any real API key.</w:t>
+        <w:t>选择内置 demo essay。</w:t>
       </w:r>
     </w:p>
     <w:p>
@@ -1104,7 +1160,7 @@
           <w:rFonts w:ascii="Arial" w:hAnsi="Arial" w:eastAsia="Arial"/>
           <w:sz w:val="18"/>
         </w:rPr>
-        <w:t>Click Page 2: ESL Feedback Review.</w:t>
+        <w:t>展示 assignment prompt、essay text、reviewer settings。</w:t>
       </w:r>
     </w:p>
     <w:p>
@@ -1117,12 +1173,25 @@
           <w:rFonts w:ascii="Arial" w:hAnsi="Arial" w:eastAsia="Arial"/>
           <w:sz w:val="18"/>
         </w:rPr>
-        <w:t>Show the essay input, reviewer source selector, and Run Knowledge-Grounded Feedback button.</w:t>
+        <w:t>如果页面已有 routed feedback，就直接展示；如果没有，点击生成/路由按钮。</w:t>
       </w:r>
     </w:p>
     <w:p>
       <w:pPr>
-        <w:spacing w:before="40" w:after="160"/>
+        <w:pStyle w:val="ListBullet"/>
+        <w:spacing w:after="40"/>
+      </w:pPr>
+      <w:r>
+        <w:rPr>
+          <w:rFonts w:ascii="Arial" w:hAnsi="Arial" w:eastAsia="Arial"/>
+          <w:sz w:val="18"/>
+        </w:rPr>
+        <w:t>指向 auto-accepted items、teacher-review items、risk score、evidence signal、review explanation。</w:t>
+      </w:r>
+    </w:p>
+    <w:p>
+      <w:pPr>
+        <w:spacing w:before="60" w:after="160"/>
         <w:ind w:left="216" w:right="72"/>
         <w:shd w:fill="F4F6F9"/>
       </w:pPr>
@@ -1132,14 +1201,14 @@
           <w:b/>
           <w:sz w:val="20"/>
         </w:rPr>
-        <w:t xml:space="preserve">Narration: </w:t>
+        <w:t xml:space="preserve">English narration: </w:t>
       </w:r>
       <w:r>
         <w:rPr>
           <w:rFonts w:ascii="Arial" w:hAnsi="Arial" w:eastAsia="Arial"/>
           <w:sz w:val="20"/>
         </w:rPr>
-        <w:t>ConsensusScope compares multiple LLM feedback outputs and routes each suggestion into either low-risk auto-accept or teacher review. It is not an automatic essay scorer and it does not replace teacher judgment.</w:t>
+        <w:t>In the single essay window, a teacher can paste an ESL draft, provide the assignment prompt, and generate AI-style feedback candidates. The system then routes each feedback item before it reaches the student. Each item receives a risk score, evidence signal, review priority, and short explanation for the teacher.</w:t>
       </w:r>
     </w:p>
     <w:p>
@@ -1152,7 +1221,7 @@
           <w:b/>
           <w:sz w:val="24"/>
         </w:rPr>
-        <w:t>0:45-1:10  Knowledge grounding</w:t>
+        <w:t>0:50-1:10  Page 3: Batch Review</w:t>
       </w:r>
     </w:p>
     <w:p>
@@ -1165,7 +1234,7 @@
           <w:b/>
           <w:sz w:val="20"/>
         </w:rPr>
-        <w:t>Screen actions:</w:t>
+        <w:t>屏幕操作（中文，录屏时照做）</w:t>
       </w:r>
     </w:p>
     <w:p>
@@ -1178,7 +1247,7 @@
           <w:rFonts w:ascii="Arial" w:hAnsi="Arial" w:eastAsia="Arial"/>
           <w:sz w:val="18"/>
         </w:rPr>
-        <w:t>Run the no-API deterministic feedback demo.</w:t>
+        <w:t>点击 Page 3: Batch Review。</w:t>
       </w:r>
     </w:p>
     <w:p>
@@ -1191,7 +1260,7 @@
           <w:rFonts w:ascii="Arial" w:hAnsi="Arial" w:eastAsia="Arial"/>
           <w:sz w:val="18"/>
         </w:rPr>
-        <w:t>Open the Knowledge Evidence tab.</w:t>
+        <w:t>展示 packaged synthetic CSV / sample data。</w:t>
       </w:r>
     </w:p>
     <w:p>
@@ -1204,12 +1273,25 @@
           <w:rFonts w:ascii="Arial" w:hAnsi="Arial" w:eastAsia="Arial"/>
           <w:sz w:val="18"/>
         </w:rPr>
-        <w:t>Point to author, genre, character, theme, and publication-year rows.</w:t>
+        <w:t>展示 batch summary table 和 routed feedback export。</w:t>
       </w:r>
     </w:p>
     <w:p>
       <w:pPr>
-        <w:spacing w:before="40" w:after="160"/>
+        <w:pStyle w:val="ListBullet"/>
+        <w:spacing w:after="40"/>
+      </w:pPr>
+      <w:r>
+        <w:rPr>
+          <w:rFonts w:ascii="Arial" w:hAnsi="Arial" w:eastAsia="Arial"/>
+          <w:sz w:val="18"/>
+        </w:rPr>
+        <w:t>不需要上传真实文件。</w:t>
+      </w:r>
+    </w:p>
+    <w:p>
+      <w:pPr>
+        <w:spacing w:before="60" w:after="160"/>
         <w:ind w:left="216" w:right="72"/>
         <w:shd w:fill="F4F6F9"/>
       </w:pPr>
@@ -1219,14 +1301,14 @@
           <w:b/>
           <w:sz w:val="20"/>
         </w:rPr>
-        <w:t xml:space="preserve">Narration: </w:t>
+        <w:t xml:space="preserve">English narration: </w:t>
       </w:r>
       <w:r>
         <w:rPr>
           <w:rFonts w:ascii="Arial" w:hAnsi="Arial" w:eastAsia="Arial"/>
           <w:sz w:val="20"/>
         </w:rPr>
-        <w:t>The system retrieves evidence from a curated literary knowledge graph, including author, work, genre, central characters, themes, and publication year. These triples make factual feedback inspectable.</w:t>
+        <w:t>The batch window supports the practical classroom workflow: multiple essays can be processed from a CSV, then exported as routed feedback for teacher triage.</w:t>
       </w:r>
     </w:p>
     <w:p>
@@ -1239,7 +1321,7 @@
           <w:b/>
           <w:sz w:val="24"/>
         </w:rPr>
-        <w:t>1:10-1:40  Feedback adjudication</w:t>
+        <w:t>1:10-1:30  Page 4: AI Feedback Comparison</w:t>
       </w:r>
     </w:p>
     <w:p>
@@ -1252,7 +1334,7 @@
           <w:b/>
           <w:sz w:val="20"/>
         </w:rPr>
-        <w:t>Screen actions:</w:t>
+        <w:t>屏幕操作（中文，录屏时照做）</w:t>
       </w:r>
     </w:p>
     <w:p>
@@ -1265,7 +1347,7 @@
           <w:rFonts w:ascii="Arial" w:hAnsi="Arial" w:eastAsia="Arial"/>
           <w:sz w:val="18"/>
         </w:rPr>
-        <w:t>Open the Teacher View tab.</w:t>
+        <w:t>点击 Page 4: AI Feedback Comparison。</w:t>
       </w:r>
     </w:p>
     <w:p>
@@ -1278,7 +1360,7 @@
           <w:rFonts w:ascii="Arial" w:hAnsi="Arial" w:eastAsia="Arial"/>
           <w:sz w:val="18"/>
         </w:rPr>
-        <w:t>Point to the auto-accepted preview.</w:t>
+        <w:t>指向按 target span 和 issue type 对齐的反馈。</w:t>
       </w:r>
     </w:p>
     <w:p>
@@ -1291,7 +1373,55 @@
           <w:rFonts w:ascii="Arial" w:hAnsi="Arial" w:eastAsia="Arial"/>
           <w:sz w:val="18"/>
         </w:rPr>
-        <w:t>Open the Adjudication Trace tab.</w:t>
+        <w:t>指向 risk level / consensus state / review routing 相关列。</w:t>
+      </w:r>
+    </w:p>
+    <w:p>
+      <w:pPr>
+        <w:spacing w:before="60" w:after="160"/>
+        <w:ind w:left="216" w:right="72"/>
+        <w:shd w:fill="F4F6F9"/>
+      </w:pPr>
+      <w:r>
+        <w:rPr>
+          <w:rFonts w:ascii="Arial" w:hAnsi="Arial" w:eastAsia="Arial"/>
+          <w:b/>
+          <w:sz w:val="20"/>
+        </w:rPr>
+        <w:t xml:space="preserve">English narration: </w:t>
+      </w:r>
+      <w:r>
+        <w:rPr>
+          <w:rFonts w:ascii="Arial" w:hAnsi="Arial" w:eastAsia="Arial"/>
+          <w:sz w:val="20"/>
+        </w:rPr>
+        <w:t>The comparison page makes model disagreement visible. Feedback is grouped by target span and issue type, with reviewers, suggestions, risk levels, and consensus state shown together.</w:t>
+      </w:r>
+    </w:p>
+    <w:p>
+      <w:pPr>
+        <w:pStyle w:val="Heading2"/>
+      </w:pPr>
+      <w:r>
+        <w:rPr>
+          <w:rFonts w:ascii="Arial" w:hAnsi="Arial" w:eastAsia="Arial"/>
+          <w:b/>
+          <w:sz w:val="24"/>
+        </w:rPr>
+        <w:t>1:30-2:00  Page 5: Teacher Queue</w:t>
+      </w:r>
+    </w:p>
+    <w:p>
+      <w:pPr>
+        <w:spacing w:after="40"/>
+      </w:pPr>
+      <w:r>
+        <w:rPr>
+          <w:rFonts w:ascii="Arial" w:hAnsi="Arial" w:eastAsia="Arial"/>
+          <w:b/>
+          <w:sz w:val="20"/>
+        </w:rPr>
+        <w:t>屏幕操作（中文，录屏时照做）</w:t>
       </w:r>
     </w:p>
     <w:p>
@@ -1304,12 +1434,51 @@
           <w:rFonts w:ascii="Arial" w:hAnsi="Arial" w:eastAsia="Arial"/>
           <w:sz w:val="18"/>
         </w:rPr>
-        <w:t>Click Page 3: Knowledge Grounding &amp; Teacher Queue.</w:t>
+        <w:t>点击 Page 5: Teacher Queue。</w:t>
       </w:r>
     </w:p>
     <w:p>
       <w:pPr>
-        <w:spacing w:before="40" w:after="160"/>
+        <w:pStyle w:val="ListBullet"/>
+        <w:spacing w:after="40"/>
+      </w:pPr>
+      <w:r>
+        <w:rPr>
+          <w:rFonts w:ascii="Arial" w:hAnsi="Arial" w:eastAsia="Arial"/>
+          <w:sz w:val="18"/>
+        </w:rPr>
+        <w:t>停在一个 high-risk item 上，例如 meaning change 或 unsupported claim。</w:t>
+      </w:r>
+    </w:p>
+    <w:p>
+      <w:pPr>
+        <w:pStyle w:val="ListBullet"/>
+        <w:spacing w:after="40"/>
+      </w:pPr>
+      <w:r>
+        <w:rPr>
+          <w:rFonts w:ascii="Arial" w:hAnsi="Arial" w:eastAsia="Arial"/>
+          <w:sz w:val="18"/>
+        </w:rPr>
+        <w:t>指向 Feedback Safety Graph path、review confidence、evidence signal、priority、explanation。</w:t>
+      </w:r>
+    </w:p>
+    <w:p>
+      <w:pPr>
+        <w:pStyle w:val="ListBullet"/>
+        <w:spacing w:after="40"/>
+      </w:pPr>
+      <w:r>
+        <w:rPr>
+          <w:rFonts w:ascii="Arial" w:hAnsi="Arial" w:eastAsia="Arial"/>
+          <w:sz w:val="18"/>
+        </w:rPr>
+        <w:t>如果页面有 action 控件，可以选择或展示一个 teacher action。</w:t>
+      </w:r>
+    </w:p>
+    <w:p>
+      <w:pPr>
+        <w:spacing w:before="60" w:after="160"/>
         <w:ind w:left="216" w:right="72"/>
         <w:shd w:fill="F4F6F9"/>
       </w:pPr>
@@ -1319,14 +1488,14 @@
           <w:b/>
           <w:sz w:val="20"/>
         </w:rPr>
-        <w:t xml:space="preserve">Narration: </w:t>
+        <w:t xml:space="preserve">English narration: </w:t>
       </w:r>
       <w:r>
         <w:rPr>
           <w:rFonts w:ascii="Arial" w:hAnsi="Arial" w:eastAsia="Arial"/>
           <w:sz w:val="20"/>
         </w:rPr>
-        <w:t>Low-risk local grammar or style edits can be accepted, but suggestions about authorship, genre, character identity, thesis statements, or interpretation remain in the teacher-review queue.</w:t>
+        <w:t>The teacher queue prioritizes high-risk feedback first. Here are four cases: a safe local phrase edit can be accepted; a thesis-reversing suggestion is routed to review; an unsupported exam-score claim is blocked; and a teacher-dependent punctuation suggestion is now reviewable after our two-teacher diagnostic pilot.</w:t>
       </w:r>
     </w:p>
     <w:p>
@@ -1339,7 +1508,7 @@
           <w:b/>
           <w:sz w:val="24"/>
         </w:rPr>
-        <w:t>1:40-2:05  Teacher review queue</w:t>
+        <w:t>2:00-2:20  Page 6: Effectiveness Evaluation</w:t>
       </w:r>
     </w:p>
     <w:p>
@@ -1352,7 +1521,7 @@
           <w:b/>
           <w:sz w:val="20"/>
         </w:rPr>
-        <w:t>Screen actions:</w:t>
+        <w:t>屏幕操作（中文，录屏时照做）</w:t>
       </w:r>
     </w:p>
     <w:p>
@@ -1365,7 +1534,7 @@
           <w:rFonts w:ascii="Arial" w:hAnsi="Arial" w:eastAsia="Arial"/>
           <w:sz w:val="18"/>
         </w:rPr>
-        <w:t>Point to risk level, priority, agreement, and KG support fields.</w:t>
+        <w:t>点击 Page 6: Effectiveness Evaluation。</w:t>
       </w:r>
     </w:p>
     <w:p>
@@ -1378,7 +1547,7 @@
           <w:rFonts w:ascii="Arial" w:hAnsi="Arial" w:eastAsia="Arial"/>
           <w:sz w:val="18"/>
         </w:rPr>
-        <w:t>Briefly mention the auxiliary QA pages only if visible.</w:t>
+        <w:t>指向 action accuracy、risk accuracy、high-risk recall、review recall、auto-accept precision。</w:t>
       </w:r>
     </w:p>
     <w:p>
@@ -1391,12 +1560,25 @@
           <w:rFonts w:ascii="Arial" w:hAnsi="Arial" w:eastAsia="Arial"/>
           <w:sz w:val="18"/>
         </w:rPr>
-        <w:t>Avoid presenting the old QA benchmark as the main system story.</w:t>
+        <w:t>如页面有公开学习者语料 benchmark 表，指向 auto share、review share、errors reviewed。</w:t>
       </w:r>
     </w:p>
     <w:p>
       <w:pPr>
-        <w:spacing w:before="40" w:after="160"/>
+        <w:pStyle w:val="ListBullet"/>
+        <w:spacing w:after="40"/>
+      </w:pPr>
+      <w:r>
+        <w:rPr>
+          <w:rFonts w:ascii="Arial" w:hAnsi="Arial" w:eastAsia="Arial"/>
+          <w:sz w:val="18"/>
+        </w:rPr>
+        <w:t>点击 Page 7: Reports，展示 report preview 和 export buttons。</w:t>
+      </w:r>
+    </w:p>
+    <w:p>
+      <w:pPr>
+        <w:spacing w:before="60" w:after="160"/>
         <w:ind w:left="216" w:right="72"/>
         <w:shd w:fill="F4F6F9"/>
       </w:pPr>
@@ -1406,14 +1588,14 @@
           <w:b/>
           <w:sz w:val="20"/>
         </w:rPr>
-        <w:t xml:space="preserve">Narration: </w:t>
+        <w:t xml:space="preserve">English narration: </w:t>
       </w:r>
       <w:r>
         <w:rPr>
           <w:rFonts w:ascii="Arial" w:hAnsi="Arial" w:eastAsia="Arial"/>
           <w:sz w:val="20"/>
         </w:rPr>
-        <w:t>The teacher review queue shows risk level, priority, model agreement, knowledge support, and a short explanation for why human review is recommended. The system also includes auxiliary multi-model QA audit pages, but this demo focuses on ESL literary feedback.</w:t>
+        <w:t>The evaluation page separates two kinds of evidence. The synthetic checks verify implementation behavior, while the public learner-corpus benchmark evaluates routing on JFLEG, CoNLL-2014, FCE, and W&amp;I plus LOCNESS correction data. We also ran a small two-teacher blind Likert pilot over 30 feedback items. After adding deploy-time signals for teacher-dependent wording, semantic drift, and wrong local corrections, review-needed and unsafe-item recall both reach 1.000. These results validate graph-backed review routing, not classroom learning outcomes.</w:t>
       </w:r>
     </w:p>
     <w:p>
@@ -1426,7 +1608,7 @@
           <w:b/>
           <w:sz w:val="24"/>
         </w:rPr>
-        <w:t>2:05-2:25  Report export</w:t>
+        <w:t>2:20-2:30  Page 7: Reports</w:t>
       </w:r>
     </w:p>
     <w:p>
@@ -1439,7 +1621,7 @@
           <w:b/>
           <w:sz w:val="20"/>
         </w:rPr>
-        <w:t>Screen actions:</w:t>
+        <w:t>屏幕操作（中文，录屏时照做）</w:t>
       </w:r>
     </w:p>
     <w:p>
@@ -1452,7 +1634,7 @@
           <w:rFonts w:ascii="Arial" w:hAnsi="Arial" w:eastAsia="Arial"/>
           <w:sz w:val="18"/>
         </w:rPr>
-        <w:t>Click Page 8: Report Export.</w:t>
+        <w:t>停在 Reports 或返回 Page 1。</w:t>
       </w:r>
     </w:p>
     <w:p>
@@ -1465,25 +1647,12 @@
           <w:rFonts w:ascii="Arial" w:hAnsi="Arial" w:eastAsia="Arial"/>
           <w:sz w:val="18"/>
         </w:rPr>
-        <w:t>Show the literary feedback report download.</w:t>
+        <w:t>鼠标不要动，留 1 秒安静收尾。</w:t>
       </w:r>
     </w:p>
     <w:p>
       <w:pPr>
-        <w:pStyle w:val="ListBullet"/>
-        <w:spacing w:after="40"/>
-      </w:pPr>
-      <w:r>
-        <w:rPr>
-          <w:rFonts w:ascii="Arial" w:hAnsi="Arial" w:eastAsia="Arial"/>
-          <w:sz w:val="18"/>
-        </w:rPr>
-        <w:t>Show system_summary.json and CSV export buttons.</w:t>
-      </w:r>
-    </w:p>
-    <w:p>
-      <w:pPr>
-        <w:spacing w:before="40" w:after="160"/>
+        <w:spacing w:before="60" w:after="160"/>
         <w:ind w:left="216" w:right="72"/>
         <w:shd w:fill="F4F6F9"/>
       </w:pPr>
@@ -1493,27 +1662,22 @@
           <w:b/>
           <w:sz w:val="20"/>
         </w:rPr>
-        <w:t xml:space="preserve">Narration: </w:t>
+        <w:t xml:space="preserve">English narration: </w:t>
       </w:r>
       <w:r>
         <w:rPr>
           <w:rFonts w:ascii="Arial" w:hAnsi="Arial" w:eastAsia="Arial"/>
           <w:sz w:val="20"/>
         </w:rPr>
-        <w:t>The final page exports a Markdown feedback report and structured JSON or CSV files so the decision process can be inspected and reproduced.</w:t>
+        <w:t>ConsensusScope turns AI feedback into a reviewable teaching workflow: generate, compare, route, review, and export.</w:t>
       </w:r>
     </w:p>
     <w:p>
       <w:pPr>
-        <w:pStyle w:val="Heading2"/>
+        <w:pStyle w:val="Heading1"/>
       </w:pPr>
       <w:r>
-        <w:rPr>
-          <w:rFonts w:ascii="Arial" w:hAnsi="Arial" w:eastAsia="Arial"/>
-          <w:b/>
-          <w:sz w:val="24"/>
-        </w:rPr>
-        <w:t>2:20-2:30  Closing</w:t>
+        <w:t>3. Presenter Safety Checklist</w:t>
       </w:r>
     </w:p>
     <w:p>
@@ -1523,151 +1687,9 @@
       <w:r>
         <w:rPr>
           <w:rFonts w:ascii="Arial" w:hAnsi="Arial" w:eastAsia="Arial"/>
-          <w:b/>
-          <w:sz w:val="20"/>
-        </w:rPr>
-        <w:t>Screen actions:</w:t>
-      </w:r>
-    </w:p>
-    <w:p>
-      <w:pPr>
-        <w:pStyle w:val="ListBullet"/>
-        <w:spacing w:after="40"/>
-      </w:pPr>
-      <w:r>
-        <w:rPr>
-          <w:rFonts w:ascii="Arial" w:hAnsi="Arial" w:eastAsia="Arial"/>
           <w:sz w:val="18"/>
         </w:rPr>
-        <w:t>Return to Page 1 or stay on Report Export.</w:t>
-      </w:r>
-    </w:p>
-    <w:p>
-      <w:pPr>
-        <w:pStyle w:val="ListBullet"/>
-        <w:spacing w:after="40"/>
-      </w:pPr>
-      <w:r>
-        <w:rPr>
-          <w:rFonts w:ascii="Arial" w:hAnsi="Arial" w:eastAsia="Arial"/>
-          <w:sz w:val="18"/>
-        </w:rPr>
-        <w:t>Stop moving the mouse.</w:t>
-      </w:r>
-    </w:p>
-    <w:p>
-      <w:pPr>
-        <w:pStyle w:val="ListBullet"/>
-        <w:spacing w:after="40"/>
-      </w:pPr>
-      <w:r>
-        <w:rPr>
-          <w:rFonts w:ascii="Arial" w:hAnsi="Arial" w:eastAsia="Arial"/>
-          <w:sz w:val="18"/>
-        </w:rPr>
-        <w:t>Leave one second of silence after the final sentence before stopping the recording.</w:t>
-      </w:r>
-    </w:p>
-    <w:p>
-      <w:pPr>
-        <w:spacing w:before="40" w:after="160"/>
-        <w:ind w:left="216" w:right="72"/>
-        <w:shd w:fill="F4F6F9"/>
-      </w:pPr>
-      <w:r>
-        <w:rPr>
-          <w:rFonts w:ascii="Arial" w:hAnsi="Arial" w:eastAsia="Arial"/>
-          <w:b/>
-          <w:sz w:val="20"/>
-        </w:rPr>
-        <w:t xml:space="preserve">Narration: </w:t>
-      </w:r>
-      <w:r>
-        <w:rPr>
-          <w:rFonts w:ascii="Arial" w:hAnsi="Arial" w:eastAsia="Arial"/>
-          <w:sz w:val="20"/>
-        </w:rPr>
-        <w:t>ConsensusScope helps decide when AI feedback requires human review.</w:t>
-      </w:r>
-    </w:p>
-    <w:p>
-      <w:pPr>
-        <w:pStyle w:val="Heading1"/>
-      </w:pPr>
-      <w:r>
-        <w:t>3. Presenter Checklist</w:t>
-      </w:r>
-    </w:p>
-    <w:p>
-      <w:pPr>
-        <w:pStyle w:val="ListBullet"/>
-      </w:pPr>
-      <w:r>
-        <w:rPr>
-          <w:rFonts w:ascii="Arial" w:hAnsi="Arial" w:eastAsia="Arial"/>
-          <w:sz w:val="20"/>
-        </w:rPr>
-        <w:t>Use English narration for international conference submission.</w:t>
-      </w:r>
-    </w:p>
-    <w:p>
-      <w:pPr>
-        <w:pStyle w:val="ListBullet"/>
-      </w:pPr>
-      <w:r>
-        <w:rPr>
-          <w:rFonts w:ascii="Arial" w:hAnsi="Arial" w:eastAsia="Arial"/>
-          <w:sz w:val="20"/>
-        </w:rPr>
-        <w:t>Keep the video at or below 2 minutes 30 seconds.</w:t>
-      </w:r>
-    </w:p>
-    <w:p>
-      <w:pPr>
-        <w:pStyle w:val="ListBullet"/>
-      </w:pPr>
-      <w:r>
-        <w:rPr>
-          <w:rFonts w:ascii="Arial" w:hAnsi="Arial" w:eastAsia="Arial"/>
-          <w:sz w:val="20"/>
-        </w:rPr>
-        <w:t>Do not type or reveal real API keys.</w:t>
-      </w:r>
-    </w:p>
-    <w:p>
-      <w:pPr>
-        <w:pStyle w:val="ListBullet"/>
-      </w:pPr>
-      <w:r>
-        <w:rPr>
-          <w:rFonts w:ascii="Arial" w:hAnsi="Arial" w:eastAsia="Arial"/>
-          <w:sz w:val="20"/>
-        </w:rPr>
-        <w:t>Do not claim teacher-study or classroom annotation results that are not in the data.</w:t>
-      </w:r>
-    </w:p>
-    <w:p>
-      <w:pPr>
-        <w:pStyle w:val="ListBullet"/>
-      </w:pPr>
-      <w:r>
-        <w:rPr>
-          <w:rFonts w:ascii="Arial" w:hAnsi="Arial" w:eastAsia="Arial"/>
-          <w:sz w:val="20"/>
-        </w:rPr>
-        <w:t>Do not frame ConsensusScope as an automatic essay scorer or teacher replacement.</w:t>
-      </w:r>
-    </w:p>
-    <w:p>
-      <w:pPr>
-        <w:pStyle w:val="ListBullet"/>
-      </w:pPr>
-      <w:r>
-        <w:rPr>
-          <w:rFonts w:ascii="Arial" w:hAnsi="Arial" w:eastAsia="Arial"/>
-          <w:sz w:val="20"/>
-        </w:rPr>
-        <w:t>Keep auxiliary QA pages clearly secondary to the ESL literary-feedback workflow.</w:t>
+        <w:t>Use English narration; show only synthetic demo records; do not reveal API keys or service credentials; do not claim classroom learning gains; do not frame ConsensusScope as a teacher replacement or automatic essay scorer; do not bring back the learned meta-judge claim.</w:t>
       </w:r>
     </w:p>
     <w:sectPr>
@@ -1694,7 +1716,7 @@
         <w:color w:val="777777"/>
         <w:sz w:val="16"/>
       </w:rPr>
-      <w:t>ConsensusScope EMNLP demo script · English · 2:30</w:t>
+      <w:t>ConsensusScope EMNLP demo script · 2:30</w:t>
     </w:r>
   </w:p>
 </w:ftr>

</xml_diff>